<commit_message>
V.Khanh Update Class Diagram
</commit_message>
<xml_diff>
--- a/doc/N04_4_ApplicationDevelopment_OOAD_v1.docx
+++ b/doc/N04_4_ApplicationDevelopment_OOAD_v1.docx
@@ -392,7 +392,7 @@
           <w:sz w:val="26"/>
           <w:szCs w:val="26"/>
         </w:rPr>
-        <w:t>4</w:t>
+        <w:t>15</w:t>
       </w:r>
       <w:r>
         <w:rPr>
@@ -487,6 +487,49 @@
           <w:szCs w:val="26"/>
         </w:rPr>
       </w:pPr>
+      <w:r>
+        <w:rPr>
+          <w:rFonts w:ascii="Times New Roman" w:hAnsi="Times New Roman" w:cs="Times New Roman"/>
+          <w:b/>
+          <w:sz w:val="26"/>
+          <w:szCs w:val="26"/>
+        </w:rPr>
+        <w:drawing>
+          <wp:inline distT="0" distB="0" distL="0" distR="0" wp14:anchorId="027A720B" wp14:editId="3C8283BC">
+            <wp:extent cx="6511925" cy="3574415"/>
+            <wp:effectExtent l="0" t="0" r="3175" b="6985"/>
+            <wp:docPr id="775564402" name="Picture 1"/>
+            <wp:cNvGraphicFramePr>
+              <a:graphicFrameLocks xmlns:a="http://schemas.openxmlformats.org/drawingml/2006/main" noChangeAspect="1"/>
+            </wp:cNvGraphicFramePr>
+            <a:graphic xmlns:a="http://schemas.openxmlformats.org/drawingml/2006/main">
+              <a:graphicData uri="http://schemas.openxmlformats.org/drawingml/2006/picture">
+                <pic:pic xmlns:pic="http://schemas.openxmlformats.org/drawingml/2006/picture">
+                  <pic:nvPicPr>
+                    <pic:cNvPr id="775564402" name=""/>
+                    <pic:cNvPicPr/>
+                  </pic:nvPicPr>
+                  <pic:blipFill>
+                    <a:blip r:embed="rId8"/>
+                    <a:stretch>
+                      <a:fillRect/>
+                    </a:stretch>
+                  </pic:blipFill>
+                  <pic:spPr>
+                    <a:xfrm>
+                      <a:off x="0" y="0"/>
+                      <a:ext cx="6511925" cy="3574415"/>
+                    </a:xfrm>
+                    <a:prstGeom prst="rect">
+                      <a:avLst/>
+                    </a:prstGeom>
+                  </pic:spPr>
+                </pic:pic>
+              </a:graphicData>
+            </a:graphic>
+          </wp:inline>
+        </w:drawing>
+      </w:r>
     </w:p>
     <w:p>
       <w:pPr>
@@ -886,6 +929,7 @@
               <w:rPr>
                 <w:rFonts w:ascii="Times New Roman" w:hAnsi="Times New Roman" w:cs="Times New Roman"/>
               </w:rPr>
+              <w:lastRenderedPageBreak/>
               <w:t>1.1</w:t>
             </w:r>
           </w:p>
@@ -1885,7 +1929,6 @@
                 <w:rFonts w:ascii="Times New Roman" w:hAnsi="Times New Roman" w:cs="Times New Roman"/>
                 <w:b/>
               </w:rPr>
-              <w:lastRenderedPageBreak/>
               <w:t>2</w:t>
             </w:r>
           </w:p>
@@ -2890,6 +2933,7 @@
                 <w:b/>
                 <w:color w:val="000000" w:themeColor="text1"/>
               </w:rPr>
+              <w:lastRenderedPageBreak/>
               <w:t>STT</w:t>
             </w:r>
           </w:p>
@@ -3918,7 +3962,6 @@
               <w:rPr>
                 <w:rFonts w:ascii="Times New Roman" w:hAnsi="Times New Roman" w:cs="Times New Roman"/>
               </w:rPr>
-              <w:lastRenderedPageBreak/>
               <w:t>2.1</w:t>
             </w:r>
           </w:p>
@@ -5064,6 +5107,7 @@
               <w:rPr>
                 <w:rFonts w:ascii="Times New Roman" w:hAnsi="Times New Roman" w:cs="Times New Roman"/>
               </w:rPr>
+              <w:lastRenderedPageBreak/>
               <w:t>1.1</w:t>
             </w:r>
           </w:p>
@@ -6049,7 +6093,6 @@
               <w:rPr>
                 <w:rFonts w:ascii="Times New Roman" w:hAnsi="Times New Roman" w:cs="Times New Roman"/>
               </w:rPr>
-              <w:lastRenderedPageBreak/>
               <w:t>2.1</w:t>
             </w:r>
           </w:p>
@@ -7063,6 +7106,7 @@
               <w:rPr>
                 <w:rFonts w:ascii="Times New Roman" w:hAnsi="Times New Roman" w:cs="Times New Roman"/>
               </w:rPr>
+              <w:lastRenderedPageBreak/>
               <w:t>1.1</w:t>
             </w:r>
           </w:p>
@@ -8198,7 +8242,6 @@
               <w:rPr>
                 <w:rFonts w:ascii="Times New Roman" w:hAnsi="Times New Roman" w:cs="Times New Roman"/>
               </w:rPr>
-              <w:lastRenderedPageBreak/>
               <w:t>2.2</w:t>
             </w:r>
           </w:p>
@@ -9204,6 +9247,7 @@
               <w:rPr>
                 <w:rFonts w:ascii="Times New Roman" w:hAnsi="Times New Roman" w:cs="Times New Roman"/>
               </w:rPr>
+              <w:lastRenderedPageBreak/>
               <w:t>1.2</w:t>
             </w:r>
           </w:p>
@@ -10345,7 +10389,6 @@
                 <w:rFonts w:ascii="Times New Roman" w:hAnsi="Times New Roman" w:cs="Times New Roman"/>
                 <w:b/>
               </w:rPr>
-              <w:lastRenderedPageBreak/>
               <w:t>2</w:t>
             </w:r>
           </w:p>
@@ -11202,6 +11245,7 @@
                 <w:b/>
                 <w:color w:val="000000" w:themeColor="text1"/>
               </w:rPr>
+              <w:lastRenderedPageBreak/>
               <w:t>STT</w:t>
             </w:r>
           </w:p>
@@ -12212,7 +12256,6 @@
               <w:rPr>
                 <w:rFonts w:ascii="Times New Roman" w:hAnsi="Times New Roman" w:cs="Times New Roman"/>
               </w:rPr>
-              <w:lastRenderedPageBreak/>
               <w:t>2.1</w:t>
             </w:r>
           </w:p>
@@ -13218,6 +13261,7 @@
               <w:rPr>
                 <w:rFonts w:ascii="Times New Roman" w:hAnsi="Times New Roman" w:cs="Times New Roman"/>
               </w:rPr>
+              <w:lastRenderedPageBreak/>
               <w:t>1.2</w:t>
             </w:r>
           </w:p>
@@ -13964,7 +14008,6 @@
               <w:rPr>
                 <w:rFonts w:ascii="Times New Roman" w:hAnsi="Times New Roman" w:cs="Times New Roman"/>
               </w:rPr>
-              <w:lastRenderedPageBreak/>
               <w:t>2.1</w:t>
             </w:r>
           </w:p>
@@ -15230,6 +15273,7 @@
               <w:rPr>
                 <w:rFonts w:ascii="Times New Roman" w:hAnsi="Times New Roman" w:cs="Times New Roman"/>
               </w:rPr>
+              <w:lastRenderedPageBreak/>
               <w:t>1.4</w:t>
             </w:r>
           </w:p>
@@ -16114,7 +16158,6 @@
                 <w:rFonts w:ascii="Times New Roman" w:hAnsi="Times New Roman" w:cs="Times New Roman"/>
                 <w:b/>
               </w:rPr>
-              <w:lastRenderedPageBreak/>
               <w:t>3</w:t>
             </w:r>
           </w:p>
@@ -17345,6 +17388,7 @@
               <w:rPr>
                 <w:rFonts w:ascii="Times New Roman" w:hAnsi="Times New Roman" w:cs="Times New Roman"/>
               </w:rPr>
+              <w:lastRenderedPageBreak/>
               <w:t>1.6</w:t>
             </w:r>
           </w:p>
@@ -18104,7 +18148,6 @@
                 <w:rFonts w:ascii="Times New Roman" w:hAnsi="Times New Roman" w:cs="Times New Roman"/>
                 <w:b/>
               </w:rPr>
-              <w:lastRenderedPageBreak/>
               <w:t>4</w:t>
             </w:r>
           </w:p>
@@ -19327,6 +19370,7 @@
                 <w:rFonts w:ascii="Times New Roman" w:hAnsi="Times New Roman" w:cs="Times New Roman"/>
                 <w:b/>
               </w:rPr>
+              <w:lastRenderedPageBreak/>
               <w:t>2</w:t>
             </w:r>
           </w:p>
@@ -19977,7 +20021,6 @@
           <w:color w:val="1B365D"/>
           <w:sz w:val="26"/>
         </w:rPr>
-        <w:lastRenderedPageBreak/>
         <w:t>Thực thể DichVu:</w:t>
       </w:r>
     </w:p>
@@ -21181,6 +21224,7 @@
                 <w:rFonts w:ascii="Times New Roman" w:hAnsi="Times New Roman" w:cs="Times New Roman"/>
                 <w:b/>
               </w:rPr>
+              <w:lastRenderedPageBreak/>
               <w:t>2</w:t>
             </w:r>
           </w:p>
@@ -21908,7 +21952,6 @@
                 <w:b/>
                 <w:color w:val="000000" w:themeColor="text1"/>
               </w:rPr>
-              <w:lastRenderedPageBreak/>
               <w:t>STT</w:t>
             </w:r>
           </w:p>
@@ -23436,6 +23479,7 @@
               <w:rPr>
                 <w:rFonts w:ascii="Times New Roman" w:hAnsi="Times New Roman" w:cs="Times New Roman"/>
               </w:rPr>
+              <w:lastRenderedPageBreak/>
               <w:t>1.11</w:t>
             </w:r>
           </w:p>
@@ -24195,7 +24239,6 @@
                 <w:rFonts w:ascii="Times New Roman" w:hAnsi="Times New Roman" w:cs="Times New Roman"/>
                 <w:b/>
               </w:rPr>
-              <w:lastRenderedPageBreak/>
               <w:t>4</w:t>
             </w:r>
           </w:p>
@@ -25073,6 +25116,7 @@
               <w:rPr>
                 <w:rFonts w:ascii="Times New Roman" w:hAnsi="Times New Roman" w:cs="Times New Roman"/>
               </w:rPr>
+              <w:lastRenderedPageBreak/>
               <w:t>1.4</w:t>
             </w:r>
           </w:p>
@@ -25956,7 +26000,6 @@
                 <w:rFonts w:ascii="Times New Roman" w:hAnsi="Times New Roman" w:cs="Times New Roman"/>
                 <w:b/>
               </w:rPr>
-              <w:lastRenderedPageBreak/>
               <w:t>4</w:t>
             </w:r>
           </w:p>
@@ -26822,6 +26865,7 @@
               <w:rPr>
                 <w:rFonts w:ascii="Times New Roman" w:hAnsi="Times New Roman" w:cs="Times New Roman"/>
               </w:rPr>
+              <w:lastRenderedPageBreak/>
               <w:t>1.4</w:t>
             </w:r>
           </w:p>
@@ -27706,7 +27750,6 @@
                 <w:rFonts w:ascii="Times New Roman" w:hAnsi="Times New Roman" w:cs="Times New Roman"/>
                 <w:b/>
               </w:rPr>
-              <w:lastRenderedPageBreak/>
               <w:t>3</w:t>
             </w:r>
           </w:p>
@@ -28693,6 +28736,7 @@
               <w:rPr>
                 <w:rFonts w:ascii="Times New Roman" w:hAnsi="Times New Roman" w:cs="Times New Roman"/>
               </w:rPr>
+              <w:lastRenderedPageBreak/>
               <w:t>1.4</w:t>
             </w:r>
           </w:p>
@@ -30336,6 +30380,7 @@
               <w:rPr>
                 <w:rFonts w:ascii="Times New Roman" w:hAnsi="Times New Roman" w:cs="Times New Roman"/>
               </w:rPr>
+              <w:lastRenderedPageBreak/>
               <w:t>1.5</w:t>
             </w:r>
           </w:p>
@@ -31096,7 +31141,6 @@
                 <w:rFonts w:ascii="Times New Roman" w:hAnsi="Times New Roman" w:cs="Times New Roman"/>
                 <w:b/>
               </w:rPr>
-              <w:lastRenderedPageBreak/>
               <w:t>3</w:t>
             </w:r>
           </w:p>
@@ -31399,12 +31443,12 @@
       </w:pPr>
     </w:p>
     <w:sectPr>
-      <w:headerReference w:type="even" r:id="rId8"/>
-      <w:headerReference w:type="default" r:id="rId9"/>
-      <w:footerReference w:type="even" r:id="rId10"/>
-      <w:footerReference w:type="default" r:id="rId11"/>
-      <w:headerReference w:type="first" r:id="rId12"/>
-      <w:footerReference w:type="first" r:id="rId13"/>
+      <w:headerReference w:type="even" r:id="rId9"/>
+      <w:headerReference w:type="default" r:id="rId10"/>
+      <w:footerReference w:type="even" r:id="rId11"/>
+      <w:footerReference w:type="default" r:id="rId12"/>
+      <w:headerReference w:type="first" r:id="rId13"/>
+      <w:footerReference w:type="first" r:id="rId14"/>
       <w:pgSz w:w="12240" w:h="15840" w:code="1"/>
       <w:pgMar w:top="851" w:right="851" w:bottom="851" w:left="1134" w:header="567" w:footer="567" w:gutter="0"/>
       <w:cols w:space="720"/>

</xml_diff>